<commit_message>
Design doc v4: cite exact .m scripts for the 4-4 and 05 figures
- 4-4 (K identification): worklog/2026_semester_S/260605/analyze_lsb_step_260605.m
  (re-measure with frfr_lsb_step_260605_v0.m)
- 05 (kpe0.08 vs HOLD): worklog/2026_semester_S/260610/compare_kpe08_hold_260610.m
  (build Am first via analyze_jitter_260610.m)

Co-Authored-By: Claude Opus 4.8 <noreply@anthropic.com>
</commit_message>
<xml_diff>
--- a/presentations/mid_term_202606/04_slides_draft/中間発表_スライド設計書_v4.docx
+++ b/presentations/mid_term_202606/04_slides_draft/中間発表_スライド設計書_v4.docx
@@ -1252,6 +1252,20 @@
           <w:color w:val="595959"/>
           <w:sz w:val="20"/>
         </w:rPr>
+        <w:t>－ 使用スクリプト：worklog/2026_semester_S/260605/analyze_lsb_step_260605.m（CSV→各段の傾きを直線回帰→_slope.png）。再測定は同フォルダ frfr_lsb_step_260605_v0.m</w:t>
+      </w:r>
+    </w:p>
+    <w:p>
+      <w:pPr>
+        <w:spacing w:before="0" w:after="40"/>
+      </w:pPr>
+      <w:r>
+        <w:rPr>
+          <w:rFonts w:ascii="游ゴシック" w:hAnsi="游ゴシック" w:eastAsia="游ゴシック"/>
+          <w:b w:val="0"/>
+          <w:color w:val="595959"/>
+          <w:sz w:val="20"/>
+        </w:rPr>
         <w:t>－ ただし260605のCSVがリポジトリに無い → ①ローカルのCSV（frfr_lsb_step_20260605_*.csv）を探して analyze_lsb_step_260605(...) を実行、または②frfr_lsb_step_260605_v0 で再測定（約3〜4分）してから解析</w:t>
       </w:r>
     </w:p>
@@ -1387,6 +1401,20 @@
           <w:sz w:val="21"/>
         </w:rPr>
         <w:t>✔（回答）新規コードは不要。2条件図のコード compare_kpe08_hold_260610 が既にあり、kpe0.08とHOLDだけを dBc/Hz で重ね描きして 260610_kpe08_vs_hold.png を出力する</w:t>
+      </w:r>
+    </w:p>
+    <w:p>
+      <w:pPr>
+        <w:spacing w:before="0" w:after="40"/>
+      </w:pPr>
+      <w:r>
+        <w:rPr>
+          <w:rFonts w:ascii="游ゴシック" w:hAnsi="游ゴシック" w:eastAsia="游ゴシック"/>
+          <w:b w:val="0"/>
+          <w:color w:val="595959"/>
+          <w:sz w:val="20"/>
+        </w:rPr>
+        <w:t>－ 使用スクリプト：worklog/2026_semester_S/260610/compare_kpe08_hold_260610.m（2条件を重ね描き→260610_kpe08_vs_hold.png）。事前に同フォルダ analyze_jitter_260610.m で Am を作成</w:t>
       </w:r>
     </w:p>
     <w:p>
@@ -1680,7 +1708,7 @@
           <w:color w:val="595959"/>
           <w:sz w:val="20"/>
         </w:rPr>
-        <w:t>－ 図タスク①：4-4のK回帰図（260605 CSV → analyze_lsb_step_260605）</w:t>
+        <w:t>－ 図タスク①：4-4のK回帰図 … worklog/2026_semester_S/260605/analyze_lsb_step_260605.m（要 260605 CSV）</w:t>
       </w:r>
     </w:p>
     <w:p>
@@ -1694,7 +1722,7 @@
           <w:color w:val="595959"/>
           <w:sz w:val="20"/>
         </w:rPr>
-        <w:t>－ 図タスク②：05の2条件図（WAV → analyze_jitter_260610 → compare_kpe08_hold_260610）</w:t>
+        <w:t>－ 図タスク②：05の2条件図 … worklog/2026_semester_S/260610/compare_kpe08_hold_260610.m（事前に同フォルダ analyze_jitter_260610.m、要 WAV）</w:t>
       </w:r>
     </w:p>
     <w:p>

</xml_diff>